<commit_message>
Revoke the JWT on logout, keep Redis data across crashes, pin consent text to its version
Logout now also revokes the post-MFA JWT, so a copy taken from the browser stops
opening re-enrollment. Redis runs with the append-only file so a fraud lock
survives a crash. A test ties the consent text to CURRENT_CONSENT_VERSION.

Co-Authored-By: Claude Sonnet 5 <noreply@anthropic.com>
</commit_message>
<xml_diff>
--- a/VoiceProject_Documentation.docx
+++ b/VoiceProject_Documentation.docx
@@ -468,7 +468,7 @@
                 <w:b w:val="0"/>
                 <w:sz w:val="20"/>
               </w:rPr>
-              <w:t>Redis 7 (Docker, redis:7-alpine)</w:t>
+              <w:t>Redis 7 (Docker, redis:7-alpine, append-only file on)</w:t>
             </w:r>
           </w:p>
         </w:tc>
@@ -852,7 +852,7 @@
                 <w:b w:val="0"/>
                 <w:sz w:val="20"/>
               </w:rPr>
-              <w:t>pytest 9.1.1 + pytest-asyncio 1.4.0 (186 tests); GitHub Actions runs them on every push and pull request, with a Postgres service for the database-setup tests</w:t>
+              <w:t>pytest 9.1.1 + pytest-asyncio 1.4.0 (202 tests); GitHub Actions runs them on every push and pull request, with a Postgres service for the database-setup tests</w:t>
             </w:r>
           </w:p>
         </w:tc>
@@ -978,7 +978,7 @@
         <w:pStyle w:val="ListBullet"/>
       </w:pPr>
       <w:r>
-        <w:t>POST /api/auth/logout deletes the Redis session key outright, so a leaked or copied token stops working the instant the user logs out server-side -- not merely cleared client-side.</w:t>
+        <w:t>POST /api/auth/logout deletes the Redis session key outright, so a leaked or copied session token stops working the instant the user logs out server-side -- not merely cleared client-side. It also revokes the post-MFA JWT (see 2.8).</w:t>
       </w:r>
     </w:p>
     <w:p>
@@ -1002,7 +1002,7 @@
         <w:pStyle w:val="ListBullet"/>
       </w:pPr>
       <w:r>
-        <w:t>has_active_consent() -- requiring an active row matching the current version -- gates every enrollment and every verification attempt. Bumping the version constant in code would immediately require every existing user to re-consent before their voice features work again.</w:t>
+        <w:t>has_active_consent() -- requiring an active row matching the current version -- gates every enrollment and every verification attempt. Bumping the version constant in code would immediately require every existing user to re-consent before their voice features work again. The text users read is in the frontend, so a test (tests/test_consent_version.py) keeps a SHA-256 of the consent text for each version and fails if the text changes without a new version. A consent row still stores only the version, not the text.</w:t>
       </w:r>
     </w:p>
     <w:p>
@@ -1645,6 +1645,14 @@
     </w:p>
     <w:p>
       <w:pPr>
+        <w:pStyle w:val="ListBullet"/>
+      </w:pPr>
+      <w:r>
+        <w:t>Logout revokes the JWT as well as the session. A session can be deleted, a JWT cannot, so logout stores a cutoff time for the user (Redis key access_revoked_at:{user_id}, kept for the JWT's one-hour life) and the enrollment gate refuses any JWT issued at or before it (the token carries an iat claim; one without iat counts as issued at 0). The client sends both tokens on logout, the JWT in an X-Access-Token header, because the 30-minute session can be gone while the 1-hour JWT is still alive. A copy of the JWT taken from the browser is revoked too. The JWT is still held in the browser's localStorage, so a script injected into the page could read it while the user is logged in; revocation limits the damage, not the theft.</w:t>
+      </w:r>
+    </w:p>
+    <w:p>
+      <w:pPr>
         <w:pStyle w:val="Heading2"/>
       </w:pPr>
       <w:r>
@@ -2189,7 +2197,7 @@
     </w:p>
     <w:p>
       <w:r>
-        <w:t>The suite (186 tests) uses fakes for Redis and the models and needs no running services. Five tests of the database setup need a real Postgres and are skipped unless MIGRATION_TEST_DSN is set to a throwaway database whose name ends in _test (the test empties the public schema of whatever it is given, and refuses other names). GitHub Actions runs the whole suite, including those five against a Postgres service, on every push and pull request (.github/workflows/tests.yml). It deliberately does not install resemblyzer or faster-whisper, since the tests never load a speech model and resemblyzer would pull in several gigabytes of torch.</w:t>
+        <w:t>The suite (202 tests) uses fakes for Redis and the models and needs no running services. Five tests of the database setup need a real Postgres and are skipped unless MIGRATION_TEST_DSN is set to a throwaway database whose name ends in _test (the test empties the public schema of whatever it is given, and refuses other names). GitHub Actions runs the whole suite, including those five against a Postgres service, on every push and pull request (.github/workflows/tests.yml). It deliberately does not install resemblyzer or faster-whisper, since the tests never load a speech model and resemblyzer would pull in several gigabytes of torch.</w:t>
       </w:r>
     </w:p>
     <w:p>
@@ -2552,7 +2560,7 @@
         <w:pStyle w:val="ListBullet"/>
       </w:pPr>
       <w:r>
-        <w:t>Session state, one-time codes, and every rate-limit/lockout counter live entirely in Redis, not PostgreSQL: session:{token}, otp:{user_id}, otp_attempts:{user_id}, login_attempts:{email}, fraud_locked:{user_id}, verify_phrase:{user_id}, phrase_history:{user_id}, phrase_used:{user_id}, verify_code:{user_id}, voice_passed:{user_id}, voice_sample_embedding:{user_id}, enroll:{user_id}, and enroll_spoof:{user_id}. None of this is durable by design -- it is either TTL-bound (mostly minutes; phrase_used keeps 365 days so the record of issued phrases spans a whole cycle of the pool) or, for fraud_locked, durable specifically because it has no TTL at all.</w:t>
+        <w:t>Session state, one-time codes, and every rate-limit/lockout counter live entirely in Redis, not PostgreSQL: session:{token}, otp:{user_id}, otp_attempts:{user_id}, login_attempts:{email}, fraud_locked:{user_id}, verify_phrase:{user_id}, phrase_history:{user_id}, phrase_used:{user_id}, verify_code:{user_id}, voice_passed:{user_id}, voice_sample_embedding:{user_id}, enroll:{user_id}, and enroll_spoof:{user_id}. None of this is durable by design -- it is either TTL-bound (mostly minutes; phrase_used keeps 365 days so the record of issued phrases spans a whole cycle of the pool) or, for fraud_locked, durable specifically because it has no TTL at all. Because that lock exists only in Redis, Redis runs with its append-only file on (--appendonly yes, flushed every second): with the default hourly snapshot a crash could forget a lock set minutes earlier. The 5-rejections-in-10-minutes throttle counts rows in PostgreSQL, and the spoof count behind a lock is rebuilt from PostgreSQL, so a lost lock is re-armed by the next spoof detection.</w:t>
       </w:r>
     </w:p>
     <w:p>
@@ -4519,7 +4527,7 @@
                 <w:b w:val="0"/>
                 <w:sz w:val="20"/>
               </w:rPr>
-              <w:t>Password session</w:t>
+              <w:t>Password session and/or access token (X-Access-Token)</w:t>
             </w:r>
           </w:p>
         </w:tc>
@@ -4549,7 +4557,7 @@
                 <w:b w:val="0"/>
                 <w:sz w:val="20"/>
               </w:rPr>
-              <w:t>Invalidate the session server-side</w:t>
+              <w:t>Invalidate the session server-side and revoke the user's access tokens</w:t>
             </w:r>
           </w:p>
         </w:tc>
@@ -5422,7 +5430,7 @@
         <w:pStyle w:val="ListBullet"/>
       </w:pPr>
       <w:r>
-        <w:t>A pytest suite (186 tests) now covers the risk engine's decision branches, phrase-matching and the challenge-phrase pool, JWT auth-method validation and the start-up secret check, client-IP header handling, the login lockout counter, the enrollment and verify endpoints, the anti-spoofing level normalization, the database setup, and the evaluation metrics. Most use fakes rather than a live database or models -- runnable in isolation with pip install -r requirements-dev.txt &amp;&amp; pytest from backend/ -- and GitHub Actions runs the suite on every push and pull request.</w:t>
+        <w:t>A pytest suite (202 tests) now covers the risk engine's decision branches, phrase-matching and the challenge-phrase pool, JWT auth-method validation and the start-up secret check, client-IP header handling, the login lockout counter, the enrollment and verify endpoints, the anti-spoofing level normalization, the database setup, and the evaluation metrics. Most use fakes rather than a live database or models -- runnable in isolation with pip install -r requirements-dev.txt &amp;&amp; pytest from backend/ -- and GitHub Actions runs the suite on every push and pull request.</w:t>
       </w:r>
     </w:p>
     <w:p>

</xml_diff>

<commit_message>
Give a rejected take a new phrase and fix the screens that stayed on the old one
Enrollment now swaps the phrase after a mismatch or spoof answer, and an error
reply no longer moves it on to the next sample. A failed refresh after a rejected
verify take no longer leaves a dead phrase on screen, and the microphone the user
picked is kept across the refresh.

The README and docs also say what the logout cutoff, the fraud lock and the
consent test do not cover, with tests for the enroll gate and the cutoff lifetime.

Co-Authored-By: Claude Sonnet 5 <noreply@anthropic.com>
</commit_message>
<xml_diff>
--- a/VoiceProject_Documentation.docx
+++ b/VoiceProject_Documentation.docx
@@ -852,7 +852,7 @@
                 <w:b w:val="0"/>
                 <w:sz w:val="20"/>
               </w:rPr>
-              <w:t>pytest 9.1.1 + pytest-asyncio 1.4.0 (202 tests); GitHub Actions runs them on every push and pull request, with a Postgres service for the database-setup tests</w:t>
+              <w:t>pytest 9.1.1 + pytest-asyncio 1.4.0 (205 tests); GitHub Actions runs them on every push and pull request, with a Postgres service for the database-setup tests</w:t>
             </w:r>
           </w:p>
         </w:tc>
@@ -1002,7 +1002,7 @@
         <w:pStyle w:val="ListBullet"/>
       </w:pPr>
       <w:r>
-        <w:t>has_active_consent() -- requiring an active row matching the current version -- gates every enrollment and every verification attempt. Bumping the version constant in code would immediately require every existing user to re-consent before their voice features work again. The text users read is in the frontend, so a test (tests/test_consent_version.py) keeps a SHA-256 of the consent text for each version and fails if the text changes without a new version. A consent row still stores only the version, not the text.</w:t>
+        <w:t>has_active_consent() -- requiring an active row matching the current version -- gates every enrollment and every verification attempt. Bumping the version constant in code would immediately require every existing user to re-consent before their voice features work again. The text users read is in the frontend, so a test (tests/test_consent_version.py) keeps a SHA-256 of the consent text for each version and fails if the text changes without a new version. It is a check run by the test suite, not one made when the backend starts (nginx serves the frontend from its own mount, which the backend container does not have), so editing index.html on a running stack without a version bump and without running the tests would still not ask anyone to agree again. The hash covers the text a reader sees in the consent block (tags stripped, whitespace collapsed): markup or class changes do not trip it, wording or order changes do, button labels and app.js strings are outside it, and it cannot tell a bumped version from someone overwriting the expected hash of the current one. A consent row also stores only the version, not the text.</w:t>
       </w:r>
     </w:p>
     <w:p>
@@ -1034,7 +1034,7 @@
         <w:pStyle w:val="ListBullet"/>
       </w:pPr>
       <w:r>
-        <w:t>POST /api/voice-auth/enroll/reshuffle swaps the next not-yet-recorded phrase for a different one (e.g. the assigned sentence is awkward to read aloud); rate-limited to 10/minute.</w:t>
+        <w:t>POST /api/voice-auth/enroll/reshuffle swaps the next not-yet-recorded phrase for a different one (e.g. the assigned sentence is awkward to read aloud); rate-limited to 10/minute. The page also calls it by itself after a sample that was not accepted (phrase_mismatch, spoof_detected), so the user starts over with a new phrase, the words the last take lit are cleared and the change-phrase button is usable again (the server keeps the phrase it expects for each sample, so both change together; if the swap is refused the old phrase stays valid). An error reply that is not a rejection (unreadable audio, 429, expired enrollment, no connection, an HTML error page) keeps the page on the same sample and shows the server's message; before, it moved on to the next phrase as if the sample had been stored, leaving the page a sample ahead of the server.</w:t>
       </w:r>
     </w:p>
     <w:p>
@@ -1074,7 +1074,7 @@
         <w:pStyle w:val="ListBullet"/>
       </w:pPr>
       <w:r>
-        <w:t>POST /api/voice-auth/verify/prompt issues one random challenge phrase from the pool of 200, and never issues the same phrase to the same user again until every phrase in the pool has been used once (Redis set phrase_used:{user_id}, 365-day TTL). When the pool is exhausted a new cycle starts, seeded with the user's last 10 phrases (PHRASE_HISTORY_SIZE, Redis list phrase_history:{user_id}) so that none of them comes straight back. The point is replay resistance: a recording captured during an earlier session is genuine speech, so neither speaker verification nor anti-spoofing can reject it -- only a different challenge sentence can. An earlier version excluded just the last 10 phrases, and a test showed the first phrase coming back on the 12th call. The window is now roughly two hundred logins, not closed (see Appendix B). The issued phrase is cached (verify_phrase:{user_id}, 120-second TTL) and deleted the instant /verify reads it, so it can only ever be consumed once.</w:t>
+        <w:t>POST /api/voice-auth/verify/prompt issues one random challenge phrase from the pool of 200, and never issues the same phrase to the same user again until every phrase in the pool has been used once (Redis set phrase_used:{user_id}, 365-day TTL). When the pool is exhausted a new cycle starts, seeded with the user's last 10 phrases (PHRASE_HISTORY_SIZE, Redis list phrase_history:{user_id}) so that none of them comes straight back. The point is replay resistance: a recording captured during an earlier session is genuine speech, so neither speaker verification nor anti-spoofing can reject it -- only a different challenge sentence can. An earlier version excluded just the last 10 phrases, and a test showed the first phrase coming back on the 12th call. The window is now roughly two hundred logins, not closed (see Appendix B). The issued phrase is cached (verify_phrase:{user_id}, 120-second TTL) and deleted the instant /verify reads it, so it can only ever be consumed once. Because of that, the page fetches a new phrase straight after every rejected attempt. If that refresh fails (the microphone will not reopen, or the prompt endpoint answers 429), a microphone that will not reopen no longer stops the new phrase from showing, and when no new phrase can be fetched the dead one is taken down and only the change-phrase button is offered; before, the old phrase stayed on screen with the record button hidden and no message. The microphone the user picked is kept across the refresh (it used to fall back to the default one after every rejection).</w:t>
       </w:r>
     </w:p>
     <w:p>
@@ -1648,7 +1648,7 @@
         <w:pStyle w:val="ListBullet"/>
       </w:pPr>
       <w:r>
-        <w:t>Logout revokes the JWT as well as the session. A session can be deleted, a JWT cannot, so logout stores a cutoff time for the user (Redis key access_revoked_at:{user_id}, kept for the JWT's one-hour life) and the enrollment gate refuses any JWT issued at or before it (the token carries an iat claim; one without iat counts as issued at 0). The client sends both tokens on logout, the JWT in an X-Access-Token header, because the 30-minute session can be gone while the 1-hour JWT is still alive. A copy of the JWT taken from the browser is revoked too. The JWT is still held in the browser's localStorage, so a script injected into the page could read it while the user is logged in; revocation limits the damage, not the theft.</w:t>
+        <w:t>Logout revokes the JWT as well as the session. A session can be deleted, a JWT cannot, so logout stores a cutoff time for the user (Redis key access_revoked_at:{user_id}, kept for the JWT's one-hour life) and the enrollment gate refuses any JWT issued at or before it (the token carries an iat claim; one without iat counts as issued at 0). The client sends both tokens on logout, the JWT in an X-Access-Token header, because the 30-minute session can be gone while the 1-hour JWT is still alive. A copy of the JWT taken from the browser is revoked too. The cutoff is per user, not per token, so logging out on one device revokes the JWT held on another (acceptable for a one-user project; a real deployment would use a per-token denylist with a jti claim). The cutoff's lifetime and the token's expiry come from one constant (ACCESS_TOKEN_LIFETIME), and a test fails if the cutoff is kept for less than a token can live. Like the fraud lock the cutoff exists only in Redis, so losing Redis data lets a still-valid JWT work again until it expires (at most an hour). The JWT is still held in the browser's localStorage, so a script injected into the page could read it while the user is logged in; revocation limits the damage, not the theft.</w:t>
       </w:r>
     </w:p>
     <w:p>
@@ -2197,7 +2197,7 @@
     </w:p>
     <w:p>
       <w:r>
-        <w:t>The suite (202 tests) uses fakes for Redis and the models and needs no running services. Five tests of the database setup need a real Postgres and are skipped unless MIGRATION_TEST_DSN is set to a throwaway database whose name ends in _test (the test empties the public schema of whatever it is given, and refuses other names). GitHub Actions runs the whole suite, including those five against a Postgres service, on every push and pull request (.github/workflows/tests.yml). It deliberately does not install resemblyzer or faster-whisper, since the tests never load a speech model and resemblyzer would pull in several gigabytes of torch.</w:t>
+        <w:t>The suite (205 tests) uses fakes for Redis and the models and needs no running services. Five tests of the database setup need a real Postgres and are skipped unless MIGRATION_TEST_DSN is set to a throwaway database whose name ends in _test (the test empties the public schema of whatever it is given, and refuses other names). Two more tests read files outside backend/ (.env.example and frontend/index.html) and skip inside the backend container, which mounts only backend/: there the suite reports 198 passed and 7 skipped, while on a full checkout with a Postgres all 205 run. GitHub Actions runs the whole suite, including those five against a Postgres service, on every push and pull request (.github/workflows/tests.yml). It deliberately does not install resemblyzer or faster-whisper, since the tests never load a speech model and resemblyzer would pull in several gigabytes of torch.</w:t>
       </w:r>
     </w:p>
     <w:p>
@@ -2560,7 +2560,7 @@
         <w:pStyle w:val="ListBullet"/>
       </w:pPr>
       <w:r>
-        <w:t>Session state, one-time codes, and every rate-limit/lockout counter live entirely in Redis, not PostgreSQL: session:{token}, otp:{user_id}, otp_attempts:{user_id}, login_attempts:{email}, fraud_locked:{user_id}, verify_phrase:{user_id}, phrase_history:{user_id}, phrase_used:{user_id}, verify_code:{user_id}, voice_passed:{user_id}, voice_sample_embedding:{user_id}, enroll:{user_id}, and enroll_spoof:{user_id}. None of this is durable by design -- it is either TTL-bound (mostly minutes; phrase_used keeps 365 days so the record of issued phrases spans a whole cycle of the pool) or, for fraud_locked, durable specifically because it has no TTL at all. Because that lock exists only in Redis, Redis runs with its append-only file on (--appendonly yes, flushed every second): with the default hourly snapshot a crash could forget a lock set minutes earlier. The 5-rejections-in-10-minutes throttle counts rows in PostgreSQL, and the spoof count behind a lock is rebuilt from PostgreSQL, so a lost lock is re-armed by the next spoof detection.</w:t>
+        <w:t>Session state, one-time codes, and every rate-limit/lockout counter live entirely in Redis, not PostgreSQL: session:{token}, otp:{user_id}, otp_attempts:{user_id}, login_attempts:{email}, fraud_locked:{user_id}, verify_phrase:{user_id}, phrase_history:{user_id}, phrase_used:{user_id}, verify_code:{user_id}, voice_passed:{user_id}, voice_sample_embedding:{user_id}, enroll:{user_id}, and enroll_spoof:{user_id}. None of this is durable by design -- it is either TTL-bound (mostly minutes; phrase_used keeps 365 days so the record of issued phrases spans a whole cycle of the pool) or, for fraud_locked, durable specifically because it has no TTL at all. Because that lock exists only in Redis, Redis runs with its append-only file on (--appendonly yes, flushed every second, policy appendfsync everysec): with the default hourly snapshot a crash could forget a lock set minutes earlier. A power or VM failure can still lose about a second of writes; a Redis process killed with SIGKILL straight after a reply lost nothing in 6 of 6 tries on a scratch volume, since the operating system still held the data. The lock is read by /verify only and does not gate enrollment. The 5-rejections-in-10-minutes throttle counts rows in PostgreSQL, and the spoof count behind a lock is rebuilt from PostgreSQL, so a lost lock comes back at the next spoof detection only if two earlier ones are still inside the 30-minute window; otherwise the lock is gone and the attacker starts again with a fresh budget of three.</w:t>
       </w:r>
     </w:p>
     <w:p>
@@ -5430,7 +5430,7 @@
         <w:pStyle w:val="ListBullet"/>
       </w:pPr>
       <w:r>
-        <w:t>A pytest suite (202 tests) now covers the risk engine's decision branches, phrase-matching and the challenge-phrase pool, JWT auth-method validation and the start-up secret check, client-IP header handling, the login lockout counter, the enrollment and verify endpoints, the anti-spoofing level normalization, the database setup, and the evaluation metrics. Most use fakes rather than a live database or models -- runnable in isolation with pip install -r requirements-dev.txt &amp;&amp; pytest from backend/ -- and GitHub Actions runs the suite on every push and pull request.</w:t>
+        <w:t>A pytest suite (205 tests) now covers the risk engine's decision branches, phrase-matching and the challenge-phrase pool, JWT auth-method validation and the start-up secret check, client-IP header handling, the login lockout counter, the enrollment and verify endpoints, the anti-spoofing level normalization, the database setup, and the evaluation metrics. Most use fakes rather than a live database or models -- runnable in isolation with pip install -r requirements-dev.txt &amp;&amp; pytest from backend/ -- and GitHub Actions runs the suite on every push and pull request.</w:t>
       </w:r>
     </w:p>
     <w:p>

</xml_diff>